<commit_message>
docs(qa): update Report5/Report7 test documentation and add Report5 templates
</commit_message>
<xml_diff>
--- a/docs/qa/TestExecutionGuide.docx
+++ b/docs/qa/TestExecutionGuide.docx
@@ -497,7 +497,7 @@
         <w:jc w:val="both"/>
       </w:pPr>
       <w:r>
-        <w:t xml:space="preserve">62 file, 470 test — mỗi file gom theo 1 feature/nhóm scenario liên quan (đánh số theo đúng ID trong SU26SE102-GSU26SE52_QA_TestCases.xlsx), không theo kiểu 1-file-1-scenario. Muốn xem chi tiết từng test case (mô tả, assertion, dòng code) thì mở thẳng file tương ứng trong tests/unit/ — comment đầu file luôn ghi rõ component/service được test dựa trên ("Grounded in ...") và sheet Excel tương ứng.</w:t>
+        <w:t xml:space="preserve">62 file, 470 test — mỗi file gom theo 1 feature/nhóm chức năng liên quan, không theo kiểu 1-file-1-scenario. 53 file test giao diện được ghi thành test case chức năng trong Report5_Test_Report.xlsx (cột Note trỏ tới file và ID của test), 9 file test logic được ghi theo từng hàm trong SU26SE102-GSU26SE52_QA_TestCases.xlsx. Muốn xem chi tiết từng test case (mô tả, assertion, dòng code) thì mở thẳng file tương ứng trong tests/unit/ — comment đầu file luôn ghi rõ component/service được test dựa trên ("Grounded in ...").</w:t>
       </w:r>
     </w:p>
     <w:tbl>
@@ -3898,7 +3898,7 @@
         <w:spacing w:after="80"/>
       </w:pPr>
       <w:r>
-        <w:t xml:space="preserve">Cập nhật luôn sheet Automation Summary trong SU26SE102-GSU26SE52_QA_TestCases.xlsx (docs/qa/) — cột trạng thái + dòng Totals — để file này không bị lệch so với thực tế như đã từng xảy ra.</w:t>
+        <w:t xml:space="preserve">Sau khi chạy lại test, cập nhật luôn Report5_Test_Report.xlsx (kết quả Round 1, Test date) và SU26SE102-GSU26SE52_QA_TestCases.xlsx (Passed/Failed, Executed Date) trong docs/qa/ để hai file này không bị lệch so với thực tế như đã từng xảy ra.</w:t>
       </w:r>
     </w:p>
     <w:p>

</xml_diff>